<commit_message>
save only best epoch in table and added other missing metrics, building count added
</commit_message>
<xml_diff>
--- a/metrics_report_all.docx
+++ b/metrics_report_all.docx
@@ -28,7 +28,7 @@
     </w:p>
     <w:p>
       <w:r>
-        <w:t>Training and Validation Metrics:</w:t>
+        <w:t>Training &amp; Validation Metrics for Best Epoch (by validation IoU):</w:t>
       </w:r>
     </w:p>
     <w:tbl>
@@ -37,19 +37,24 @@
         <w:tblLook w:firstColumn="1" w:firstRow="1" w:lastColumn="0" w:lastRow="0" w:noHBand="0" w:noVBand="1" w:val="04A0"/>
       </w:tblPr>
       <w:tblGrid>
-        <w:gridCol w:w="1080"/>
-        <w:gridCol w:w="1080"/>
-        <w:gridCol w:w="1080"/>
-        <w:gridCol w:w="1080"/>
-        <w:gridCol w:w="1080"/>
-        <w:gridCol w:w="1080"/>
-        <w:gridCol w:w="1080"/>
-        <w:gridCol w:w="1080"/>
+        <w:gridCol w:w="665"/>
+        <w:gridCol w:w="665"/>
+        <w:gridCol w:w="665"/>
+        <w:gridCol w:w="665"/>
+        <w:gridCol w:w="665"/>
+        <w:gridCol w:w="665"/>
+        <w:gridCol w:w="665"/>
+        <w:gridCol w:w="665"/>
+        <w:gridCol w:w="665"/>
+        <w:gridCol w:w="665"/>
+        <w:gridCol w:w="665"/>
+        <w:gridCol w:w="665"/>
+        <w:gridCol w:w="665"/>
       </w:tblGrid>
       <w:tr>
         <w:tc>
           <w:tcPr>
-            <w:tcW w:type="dxa" w:w="1080"/>
+            <w:tcW w:type="dxa" w:w="665"/>
           </w:tcPr>
           <w:p>
             <w:r>
@@ -59,7 +64,7 @@
         </w:tc>
         <w:tc>
           <w:tcPr>
-            <w:tcW w:type="dxa" w:w="1080"/>
+            <w:tcW w:type="dxa" w:w="665"/>
           </w:tcPr>
           <w:p>
             <w:r>
@@ -69,7 +74,7 @@
         </w:tc>
         <w:tc>
           <w:tcPr>
-            <w:tcW w:type="dxa" w:w="1080"/>
+            <w:tcW w:type="dxa" w:w="665"/>
           </w:tcPr>
           <w:p>
             <w:r>
@@ -79,7 +84,7 @@
         </w:tc>
         <w:tc>
           <w:tcPr>
-            <w:tcW w:type="dxa" w:w="1080"/>
+            <w:tcW w:type="dxa" w:w="665"/>
           </w:tcPr>
           <w:p>
             <w:r>
@@ -89,7 +94,37 @@
         </w:tc>
         <w:tc>
           <w:tcPr>
-            <w:tcW w:type="dxa" w:w="1080"/>
+            <w:tcW w:type="dxa" w:w="665"/>
+          </w:tcPr>
+          <w:p>
+            <w:r>
+              <w:t>Train Precision</w:t>
+            </w:r>
+          </w:p>
+        </w:tc>
+        <w:tc>
+          <w:tcPr>
+            <w:tcW w:type="dxa" w:w="665"/>
+          </w:tcPr>
+          <w:p>
+            <w:r>
+              <w:t>Train Recall</w:t>
+            </w:r>
+          </w:p>
+        </w:tc>
+        <w:tc>
+          <w:tcPr>
+            <w:tcW w:type="dxa" w:w="665"/>
+          </w:tcPr>
+          <w:p>
+            <w:r>
+              <w:t>Train Fscore</w:t>
+            </w:r>
+          </w:p>
+        </w:tc>
+        <w:tc>
+          <w:tcPr>
+            <w:tcW w:type="dxa" w:w="665"/>
           </w:tcPr>
           <w:p>
             <w:r>
@@ -99,7 +134,17 @@
         </w:tc>
         <w:tc>
           <w:tcPr>
-            <w:tcW w:type="dxa" w:w="1080"/>
+            <w:tcW w:type="dxa" w:w="665"/>
+          </w:tcPr>
+          <w:p>
+            <w:r>
+              <w:t>Valid IoU</w:t>
+            </w:r>
+          </w:p>
+        </w:tc>
+        <w:tc>
+          <w:tcPr>
+            <w:tcW w:type="dxa" w:w="665"/>
           </w:tcPr>
           <w:p>
             <w:r>
@@ -109,7 +154,7 @@
         </w:tc>
         <w:tc>
           <w:tcPr>
-            <w:tcW w:type="dxa" w:w="1080"/>
+            <w:tcW w:type="dxa" w:w="665"/>
           </w:tcPr>
           <w:p>
             <w:r>
@@ -119,7 +164,7 @@
         </w:tc>
         <w:tc>
           <w:tcPr>
-            <w:tcW w:type="dxa" w:w="1080"/>
+            <w:tcW w:type="dxa" w:w="665"/>
           </w:tcPr>
           <w:p>
             <w:r>
@@ -127,21 +172,31 @@
             </w:r>
           </w:p>
         </w:tc>
+        <w:tc>
+          <w:tcPr>
+            <w:tcW w:type="dxa" w:w="665"/>
+          </w:tcPr>
+          <w:p>
+            <w:r>
+              <w:t>Valid Fscore</w:t>
+            </w:r>
+          </w:p>
+        </w:tc>
       </w:tr>
       <w:tr>
         <w:tc>
           <w:tcPr>
-            <w:tcW w:type="dxa" w:w="1080"/>
+            <w:tcW w:type="dxa" w:w="665"/>
           </w:tcPr>
           <w:p>
             <w:r>
-              <w:t>1.0000</w:t>
+              <w:t>2.0000</w:t>
             </w:r>
           </w:p>
         </w:tc>
         <w:tc>
           <w:tcPr>
-            <w:tcW w:type="dxa" w:w="1080"/>
+            <w:tcW w:type="dxa" w:w="665"/>
           </w:tcPr>
           <w:p>
             <w:r>
@@ -151,7 +206,7 @@
         </w:tc>
         <w:tc>
           <w:tcPr>
-            <w:tcW w:type="dxa" w:w="1080"/>
+            <w:tcW w:type="dxa" w:w="665"/>
           </w:tcPr>
           <w:p>
             <w:r>
@@ -161,7 +216,7 @@
         </w:tc>
         <w:tc>
           <w:tcPr>
-            <w:tcW w:type="dxa" w:w="1080"/>
+            <w:tcW w:type="dxa" w:w="665"/>
           </w:tcPr>
           <w:p>
             <w:r>
@@ -171,7 +226,37 @@
         </w:tc>
         <w:tc>
           <w:tcPr>
-            <w:tcW w:type="dxa" w:w="1080"/>
+            <w:tcW w:type="dxa" w:w="665"/>
+          </w:tcPr>
+          <w:p>
+            <w:r>
+              <w:t>0.9150</w:t>
+            </w:r>
+          </w:p>
+        </w:tc>
+        <w:tc>
+          <w:tcPr>
+            <w:tcW w:type="dxa" w:w="665"/>
+          </w:tcPr>
+          <w:p>
+            <w:r>
+              <w:t>0.9236</w:t>
+            </w:r>
+          </w:p>
+        </w:tc>
+        <w:tc>
+          <w:tcPr>
+            <w:tcW w:type="dxa" w:w="665"/>
+          </w:tcPr>
+          <w:p>
+            <w:r>
+              <w:t>0.9192</w:t>
+            </w:r>
+          </w:p>
+        </w:tc>
+        <w:tc>
+          <w:tcPr>
+            <w:tcW w:type="dxa" w:w="665"/>
           </w:tcPr>
           <w:p>
             <w:r>
@@ -181,7 +266,17 @@
         </w:tc>
         <w:tc>
           <w:tcPr>
-            <w:tcW w:type="dxa" w:w="1080"/>
+            <w:tcW w:type="dxa" w:w="665"/>
+          </w:tcPr>
+          <w:p>
+            <w:r>
+              <w:t>0.7483</w:t>
+            </w:r>
+          </w:p>
+        </w:tc>
+        <w:tc>
+          <w:tcPr>
+            <w:tcW w:type="dxa" w:w="665"/>
           </w:tcPr>
           <w:p>
             <w:r>
@@ -191,7 +286,7 @@
         </w:tc>
         <w:tc>
           <w:tcPr>
-            <w:tcW w:type="dxa" w:w="1080"/>
+            <w:tcW w:type="dxa" w:w="665"/>
           </w:tcPr>
           <w:p>
             <w:r>
@@ -201,7 +296,7 @@
         </w:tc>
         <w:tc>
           <w:tcPr>
-            <w:tcW w:type="dxa" w:w="1080"/>
+            <w:tcW w:type="dxa" w:w="665"/>
           </w:tcPr>
           <w:p>
             <w:r>
@@ -209,16 +304,26 @@
             </w:r>
           </w:p>
         </w:tc>
+        <w:tc>
+          <w:tcPr>
+            <w:tcW w:type="dxa" w:w="665"/>
+          </w:tcPr>
+          <w:p>
+            <w:r>
+              <w:t>0.8448</w:t>
+            </w:r>
+          </w:p>
+        </w:tc>
       </w:tr>
     </w:tbl>
     <w:p>
       <w:r>
-        <w:t>Best Epoch (based on validation accuracy): 1.0000</w:t>
+        <w:t>Best Epoch: 2</w:t>
       </w:r>
     </w:p>
     <w:p>
       <w:r>
-        <w:t>Total Training Time: 436.0000 seconds</w:t>
+        <w:t>Total Training Time: 872.0000 seconds</w:t>
       </w:r>
     </w:p>
     <w:p>
@@ -379,7 +484,7 @@
     </w:p>
     <w:p>
       <w:r>
-        <w:t>Training and Validation Metrics:</w:t>
+        <w:t>Training &amp; Validation Metrics for Best Epoch (by validation IoU):</w:t>
       </w:r>
     </w:p>
     <w:tbl>
@@ -388,19 +493,24 @@
         <w:tblLook w:firstColumn="1" w:firstRow="1" w:lastColumn="0" w:lastRow="0" w:noHBand="0" w:noVBand="1" w:val="04A0"/>
       </w:tblPr>
       <w:tblGrid>
-        <w:gridCol w:w="1080"/>
-        <w:gridCol w:w="1080"/>
-        <w:gridCol w:w="1080"/>
-        <w:gridCol w:w="1080"/>
-        <w:gridCol w:w="1080"/>
-        <w:gridCol w:w="1080"/>
-        <w:gridCol w:w="1080"/>
-        <w:gridCol w:w="1080"/>
+        <w:gridCol w:w="665"/>
+        <w:gridCol w:w="665"/>
+        <w:gridCol w:w="665"/>
+        <w:gridCol w:w="665"/>
+        <w:gridCol w:w="665"/>
+        <w:gridCol w:w="665"/>
+        <w:gridCol w:w="665"/>
+        <w:gridCol w:w="665"/>
+        <w:gridCol w:w="665"/>
+        <w:gridCol w:w="665"/>
+        <w:gridCol w:w="665"/>
+        <w:gridCol w:w="665"/>
+        <w:gridCol w:w="665"/>
       </w:tblGrid>
       <w:tr>
         <w:tc>
           <w:tcPr>
-            <w:tcW w:type="dxa" w:w="1080"/>
+            <w:tcW w:type="dxa" w:w="665"/>
           </w:tcPr>
           <w:p>
             <w:r>
@@ -410,7 +520,7 @@
         </w:tc>
         <w:tc>
           <w:tcPr>
-            <w:tcW w:type="dxa" w:w="1080"/>
+            <w:tcW w:type="dxa" w:w="665"/>
           </w:tcPr>
           <w:p>
             <w:r>
@@ -420,7 +530,7 @@
         </w:tc>
         <w:tc>
           <w:tcPr>
-            <w:tcW w:type="dxa" w:w="1080"/>
+            <w:tcW w:type="dxa" w:w="665"/>
           </w:tcPr>
           <w:p>
             <w:r>
@@ -430,7 +540,7 @@
         </w:tc>
         <w:tc>
           <w:tcPr>
-            <w:tcW w:type="dxa" w:w="1080"/>
+            <w:tcW w:type="dxa" w:w="665"/>
           </w:tcPr>
           <w:p>
             <w:r>
@@ -440,7 +550,37 @@
         </w:tc>
         <w:tc>
           <w:tcPr>
-            <w:tcW w:type="dxa" w:w="1080"/>
+            <w:tcW w:type="dxa" w:w="665"/>
+          </w:tcPr>
+          <w:p>
+            <w:r>
+              <w:t>Train Precision</w:t>
+            </w:r>
+          </w:p>
+        </w:tc>
+        <w:tc>
+          <w:tcPr>
+            <w:tcW w:type="dxa" w:w="665"/>
+          </w:tcPr>
+          <w:p>
+            <w:r>
+              <w:t>Train Recall</w:t>
+            </w:r>
+          </w:p>
+        </w:tc>
+        <w:tc>
+          <w:tcPr>
+            <w:tcW w:type="dxa" w:w="665"/>
+          </w:tcPr>
+          <w:p>
+            <w:r>
+              <w:t>Train Fscore</w:t>
+            </w:r>
+          </w:p>
+        </w:tc>
+        <w:tc>
+          <w:tcPr>
+            <w:tcW w:type="dxa" w:w="665"/>
           </w:tcPr>
           <w:p>
             <w:r>
@@ -450,7 +590,17 @@
         </w:tc>
         <w:tc>
           <w:tcPr>
-            <w:tcW w:type="dxa" w:w="1080"/>
+            <w:tcW w:type="dxa" w:w="665"/>
+          </w:tcPr>
+          <w:p>
+            <w:r>
+              <w:t>Valid IoU</w:t>
+            </w:r>
+          </w:p>
+        </w:tc>
+        <w:tc>
+          <w:tcPr>
+            <w:tcW w:type="dxa" w:w="665"/>
           </w:tcPr>
           <w:p>
             <w:r>
@@ -460,7 +610,7 @@
         </w:tc>
         <w:tc>
           <w:tcPr>
-            <w:tcW w:type="dxa" w:w="1080"/>
+            <w:tcW w:type="dxa" w:w="665"/>
           </w:tcPr>
           <w:p>
             <w:r>
@@ -470,7 +620,7 @@
         </w:tc>
         <w:tc>
           <w:tcPr>
-            <w:tcW w:type="dxa" w:w="1080"/>
+            <w:tcW w:type="dxa" w:w="665"/>
           </w:tcPr>
           <w:p>
             <w:r>
@@ -478,11 +628,21 @@
             </w:r>
           </w:p>
         </w:tc>
+        <w:tc>
+          <w:tcPr>
+            <w:tcW w:type="dxa" w:w="665"/>
+          </w:tcPr>
+          <w:p>
+            <w:r>
+              <w:t>Valid Fscore</w:t>
+            </w:r>
+          </w:p>
+        </w:tc>
       </w:tr>
       <w:tr>
         <w:tc>
           <w:tcPr>
-            <w:tcW w:type="dxa" w:w="1080"/>
+            <w:tcW w:type="dxa" w:w="665"/>
           </w:tcPr>
           <w:p>
             <w:r>
@@ -492,7 +652,7 @@
         </w:tc>
         <w:tc>
           <w:tcPr>
-            <w:tcW w:type="dxa" w:w="1080"/>
+            <w:tcW w:type="dxa" w:w="665"/>
           </w:tcPr>
           <w:p>
             <w:r>
@@ -502,7 +662,7 @@
         </w:tc>
         <w:tc>
           <w:tcPr>
-            <w:tcW w:type="dxa" w:w="1080"/>
+            <w:tcW w:type="dxa" w:w="665"/>
           </w:tcPr>
           <w:p>
             <w:r>
@@ -512,7 +672,7 @@
         </w:tc>
         <w:tc>
           <w:tcPr>
-            <w:tcW w:type="dxa" w:w="1080"/>
+            <w:tcW w:type="dxa" w:w="665"/>
           </w:tcPr>
           <w:p>
             <w:r>
@@ -522,7 +682,37 @@
         </w:tc>
         <w:tc>
           <w:tcPr>
-            <w:tcW w:type="dxa" w:w="1080"/>
+            <w:tcW w:type="dxa" w:w="665"/>
+          </w:tcPr>
+          <w:p>
+            <w:r>
+              <w:t>0.9166</w:t>
+            </w:r>
+          </w:p>
+        </w:tc>
+        <w:tc>
+          <w:tcPr>
+            <w:tcW w:type="dxa" w:w="665"/>
+          </w:tcPr>
+          <w:p>
+            <w:r>
+              <w:t>0.9358</w:t>
+            </w:r>
+          </w:p>
+        </w:tc>
+        <w:tc>
+          <w:tcPr>
+            <w:tcW w:type="dxa" w:w="665"/>
+          </w:tcPr>
+          <w:p>
+            <w:r>
+              <w:t>0.9259</w:t>
+            </w:r>
+          </w:p>
+        </w:tc>
+        <w:tc>
+          <w:tcPr>
+            <w:tcW w:type="dxa" w:w="665"/>
           </w:tcPr>
           <w:p>
             <w:r>
@@ -532,7 +722,17 @@
         </w:tc>
         <w:tc>
           <w:tcPr>
-            <w:tcW w:type="dxa" w:w="1080"/>
+            <w:tcW w:type="dxa" w:w="665"/>
+          </w:tcPr>
+          <w:p>
+            <w:r>
+              <w:t>0.7697</w:t>
+            </w:r>
+          </w:p>
+        </w:tc>
+        <w:tc>
+          <w:tcPr>
+            <w:tcW w:type="dxa" w:w="665"/>
           </w:tcPr>
           <w:p>
             <w:r>
@@ -542,7 +742,7 @@
         </w:tc>
         <w:tc>
           <w:tcPr>
-            <w:tcW w:type="dxa" w:w="1080"/>
+            <w:tcW w:type="dxa" w:w="665"/>
           </w:tcPr>
           <w:p>
             <w:r>
@@ -552,7 +752,7 @@
         </w:tc>
         <w:tc>
           <w:tcPr>
-            <w:tcW w:type="dxa" w:w="1080"/>
+            <w:tcW w:type="dxa" w:w="665"/>
           </w:tcPr>
           <w:p>
             <w:r>
@@ -560,11 +760,21 @@
             </w:r>
           </w:p>
         </w:tc>
+        <w:tc>
+          <w:tcPr>
+            <w:tcW w:type="dxa" w:w="665"/>
+          </w:tcPr>
+          <w:p>
+            <w:r>
+              <w:t>0.8596</w:t>
+            </w:r>
+          </w:p>
+        </w:tc>
       </w:tr>
     </w:tbl>
     <w:p>
       <w:r>
-        <w:t>Best Epoch (based on validation accuracy): 1.0000</w:t>
+        <w:t>Best Epoch: 1</w:t>
       </w:r>
     </w:p>
     <w:p>
@@ -743,7 +953,7 @@
     </w:p>
     <w:p>
       <w:r>
-        <w:t>Training and Validation Metrics:</w:t>
+        <w:t>Training &amp; Validation Metrics for Best Epoch (by validation IoU):</w:t>
       </w:r>
     </w:p>
     <w:tbl>
@@ -752,19 +962,24 @@
         <w:tblLook w:firstColumn="1" w:firstRow="1" w:lastColumn="0" w:lastRow="0" w:noHBand="0" w:noVBand="1" w:val="04A0"/>
       </w:tblPr>
       <w:tblGrid>
-        <w:gridCol w:w="1080"/>
-        <w:gridCol w:w="1080"/>
-        <w:gridCol w:w="1080"/>
-        <w:gridCol w:w="1080"/>
-        <w:gridCol w:w="1080"/>
-        <w:gridCol w:w="1080"/>
-        <w:gridCol w:w="1080"/>
-        <w:gridCol w:w="1080"/>
+        <w:gridCol w:w="665"/>
+        <w:gridCol w:w="665"/>
+        <w:gridCol w:w="665"/>
+        <w:gridCol w:w="665"/>
+        <w:gridCol w:w="665"/>
+        <w:gridCol w:w="665"/>
+        <w:gridCol w:w="665"/>
+        <w:gridCol w:w="665"/>
+        <w:gridCol w:w="665"/>
+        <w:gridCol w:w="665"/>
+        <w:gridCol w:w="665"/>
+        <w:gridCol w:w="665"/>
+        <w:gridCol w:w="665"/>
       </w:tblGrid>
       <w:tr>
         <w:tc>
           <w:tcPr>
-            <w:tcW w:type="dxa" w:w="1080"/>
+            <w:tcW w:type="dxa" w:w="665"/>
           </w:tcPr>
           <w:p>
             <w:r>
@@ -774,7 +989,7 @@
         </w:tc>
         <w:tc>
           <w:tcPr>
-            <w:tcW w:type="dxa" w:w="1080"/>
+            <w:tcW w:type="dxa" w:w="665"/>
           </w:tcPr>
           <w:p>
             <w:r>
@@ -784,7 +999,7 @@
         </w:tc>
         <w:tc>
           <w:tcPr>
-            <w:tcW w:type="dxa" w:w="1080"/>
+            <w:tcW w:type="dxa" w:w="665"/>
           </w:tcPr>
           <w:p>
             <w:r>
@@ -794,7 +1009,7 @@
         </w:tc>
         <w:tc>
           <w:tcPr>
-            <w:tcW w:type="dxa" w:w="1080"/>
+            <w:tcW w:type="dxa" w:w="665"/>
           </w:tcPr>
           <w:p>
             <w:r>
@@ -804,7 +1019,37 @@
         </w:tc>
         <w:tc>
           <w:tcPr>
-            <w:tcW w:type="dxa" w:w="1080"/>
+            <w:tcW w:type="dxa" w:w="665"/>
+          </w:tcPr>
+          <w:p>
+            <w:r>
+              <w:t>Train Precision</w:t>
+            </w:r>
+          </w:p>
+        </w:tc>
+        <w:tc>
+          <w:tcPr>
+            <w:tcW w:type="dxa" w:w="665"/>
+          </w:tcPr>
+          <w:p>
+            <w:r>
+              <w:t>Train Recall</w:t>
+            </w:r>
+          </w:p>
+        </w:tc>
+        <w:tc>
+          <w:tcPr>
+            <w:tcW w:type="dxa" w:w="665"/>
+          </w:tcPr>
+          <w:p>
+            <w:r>
+              <w:t>Train Fscore</w:t>
+            </w:r>
+          </w:p>
+        </w:tc>
+        <w:tc>
+          <w:tcPr>
+            <w:tcW w:type="dxa" w:w="665"/>
           </w:tcPr>
           <w:p>
             <w:r>
@@ -814,7 +1059,17 @@
         </w:tc>
         <w:tc>
           <w:tcPr>
-            <w:tcW w:type="dxa" w:w="1080"/>
+            <w:tcW w:type="dxa" w:w="665"/>
+          </w:tcPr>
+          <w:p>
+            <w:r>
+              <w:t>Valid IoU</w:t>
+            </w:r>
+          </w:p>
+        </w:tc>
+        <w:tc>
+          <w:tcPr>
+            <w:tcW w:type="dxa" w:w="665"/>
           </w:tcPr>
           <w:p>
             <w:r>
@@ -824,7 +1079,7 @@
         </w:tc>
         <w:tc>
           <w:tcPr>
-            <w:tcW w:type="dxa" w:w="1080"/>
+            <w:tcW w:type="dxa" w:w="665"/>
           </w:tcPr>
           <w:p>
             <w:r>
@@ -834,7 +1089,7 @@
         </w:tc>
         <w:tc>
           <w:tcPr>
-            <w:tcW w:type="dxa" w:w="1080"/>
+            <w:tcW w:type="dxa" w:w="665"/>
           </w:tcPr>
           <w:p>
             <w:r>
@@ -842,11 +1097,21 @@
             </w:r>
           </w:p>
         </w:tc>
+        <w:tc>
+          <w:tcPr>
+            <w:tcW w:type="dxa" w:w="665"/>
+          </w:tcPr>
+          <w:p>
+            <w:r>
+              <w:t>Valid Fscore</w:t>
+            </w:r>
+          </w:p>
+        </w:tc>
       </w:tr>
       <w:tr>
         <w:tc>
           <w:tcPr>
-            <w:tcW w:type="dxa" w:w="1080"/>
+            <w:tcW w:type="dxa" w:w="665"/>
           </w:tcPr>
           <w:p>
             <w:r>
@@ -856,7 +1121,7 @@
         </w:tc>
         <w:tc>
           <w:tcPr>
-            <w:tcW w:type="dxa" w:w="1080"/>
+            <w:tcW w:type="dxa" w:w="665"/>
           </w:tcPr>
           <w:p>
             <w:r>
@@ -866,7 +1131,7 @@
         </w:tc>
         <w:tc>
           <w:tcPr>
-            <w:tcW w:type="dxa" w:w="1080"/>
+            <w:tcW w:type="dxa" w:w="665"/>
           </w:tcPr>
           <w:p>
             <w:r>
@@ -876,7 +1141,7 @@
         </w:tc>
         <w:tc>
           <w:tcPr>
-            <w:tcW w:type="dxa" w:w="1080"/>
+            <w:tcW w:type="dxa" w:w="665"/>
           </w:tcPr>
           <w:p>
             <w:r>
@@ -886,7 +1151,37 @@
         </w:tc>
         <w:tc>
           <w:tcPr>
-            <w:tcW w:type="dxa" w:w="1080"/>
+            <w:tcW w:type="dxa" w:w="665"/>
+          </w:tcPr>
+          <w:p>
+            <w:r>
+              <w:t>0.9188</w:t>
+            </w:r>
+          </w:p>
+        </w:tc>
+        <w:tc>
+          <w:tcPr>
+            <w:tcW w:type="dxa" w:w="665"/>
+          </w:tcPr>
+          <w:p>
+            <w:r>
+              <w:t>0.9227</w:t>
+            </w:r>
+          </w:p>
+        </w:tc>
+        <w:tc>
+          <w:tcPr>
+            <w:tcW w:type="dxa" w:w="665"/>
+          </w:tcPr>
+          <w:p>
+            <w:r>
+              <w:t>0.9201</w:t>
+            </w:r>
+          </w:p>
+        </w:tc>
+        <w:tc>
+          <w:tcPr>
+            <w:tcW w:type="dxa" w:w="665"/>
           </w:tcPr>
           <w:p>
             <w:r>
@@ -896,7 +1191,17 @@
         </w:tc>
         <w:tc>
           <w:tcPr>
-            <w:tcW w:type="dxa" w:w="1080"/>
+            <w:tcW w:type="dxa" w:w="665"/>
+          </w:tcPr>
+          <w:p>
+            <w:r>
+              <w:t>0.7351</w:t>
+            </w:r>
+          </w:p>
+        </w:tc>
+        <w:tc>
+          <w:tcPr>
+            <w:tcW w:type="dxa" w:w="665"/>
           </w:tcPr>
           <w:p>
             <w:r>
@@ -906,7 +1211,7 @@
         </w:tc>
         <w:tc>
           <w:tcPr>
-            <w:tcW w:type="dxa" w:w="1080"/>
+            <w:tcW w:type="dxa" w:w="665"/>
           </w:tcPr>
           <w:p>
             <w:r>
@@ -916,7 +1221,7 @@
         </w:tc>
         <w:tc>
           <w:tcPr>
-            <w:tcW w:type="dxa" w:w="1080"/>
+            <w:tcW w:type="dxa" w:w="665"/>
           </w:tcPr>
           <w:p>
             <w:r>
@@ -924,11 +1229,21 @@
             </w:r>
           </w:p>
         </w:tc>
+        <w:tc>
+          <w:tcPr>
+            <w:tcW w:type="dxa" w:w="665"/>
+          </w:tcPr>
+          <w:p>
+            <w:r>
+              <w:t>0.8365</w:t>
+            </w:r>
+          </w:p>
+        </w:tc>
       </w:tr>
     </w:tbl>
     <w:p>
       <w:r>
-        <w:t>Best Epoch (based on validation accuracy): 1.0000</w:t>
+        <w:t>Best Epoch: 1</w:t>
       </w:r>
     </w:p>
     <w:p>
@@ -1094,7 +1409,7 @@
     </w:p>
     <w:p>
       <w:r>
-        <w:t>Training and Validation Metrics:</w:t>
+        <w:t>Training &amp; Validation Metrics for Best Epoch (by validation IoU):</w:t>
       </w:r>
     </w:p>
     <w:tbl>
@@ -1103,19 +1418,24 @@
         <w:tblLook w:firstColumn="1" w:firstRow="1" w:lastColumn="0" w:lastRow="0" w:noHBand="0" w:noVBand="1" w:val="04A0"/>
       </w:tblPr>
       <w:tblGrid>
-        <w:gridCol w:w="1080"/>
-        <w:gridCol w:w="1080"/>
-        <w:gridCol w:w="1080"/>
-        <w:gridCol w:w="1080"/>
-        <w:gridCol w:w="1080"/>
-        <w:gridCol w:w="1080"/>
-        <w:gridCol w:w="1080"/>
-        <w:gridCol w:w="1080"/>
+        <w:gridCol w:w="665"/>
+        <w:gridCol w:w="665"/>
+        <w:gridCol w:w="665"/>
+        <w:gridCol w:w="665"/>
+        <w:gridCol w:w="665"/>
+        <w:gridCol w:w="665"/>
+        <w:gridCol w:w="665"/>
+        <w:gridCol w:w="665"/>
+        <w:gridCol w:w="665"/>
+        <w:gridCol w:w="665"/>
+        <w:gridCol w:w="665"/>
+        <w:gridCol w:w="665"/>
+        <w:gridCol w:w="665"/>
       </w:tblGrid>
       <w:tr>
         <w:tc>
           <w:tcPr>
-            <w:tcW w:type="dxa" w:w="1080"/>
+            <w:tcW w:type="dxa" w:w="665"/>
           </w:tcPr>
           <w:p>
             <w:r>
@@ -1125,7 +1445,7 @@
         </w:tc>
         <w:tc>
           <w:tcPr>
-            <w:tcW w:type="dxa" w:w="1080"/>
+            <w:tcW w:type="dxa" w:w="665"/>
           </w:tcPr>
           <w:p>
             <w:r>
@@ -1135,7 +1455,7 @@
         </w:tc>
         <w:tc>
           <w:tcPr>
-            <w:tcW w:type="dxa" w:w="1080"/>
+            <w:tcW w:type="dxa" w:w="665"/>
           </w:tcPr>
           <w:p>
             <w:r>
@@ -1145,7 +1465,7 @@
         </w:tc>
         <w:tc>
           <w:tcPr>
-            <w:tcW w:type="dxa" w:w="1080"/>
+            <w:tcW w:type="dxa" w:w="665"/>
           </w:tcPr>
           <w:p>
             <w:r>
@@ -1155,7 +1475,37 @@
         </w:tc>
         <w:tc>
           <w:tcPr>
-            <w:tcW w:type="dxa" w:w="1080"/>
+            <w:tcW w:type="dxa" w:w="665"/>
+          </w:tcPr>
+          <w:p>
+            <w:r>
+              <w:t>Train Precision</w:t>
+            </w:r>
+          </w:p>
+        </w:tc>
+        <w:tc>
+          <w:tcPr>
+            <w:tcW w:type="dxa" w:w="665"/>
+          </w:tcPr>
+          <w:p>
+            <w:r>
+              <w:t>Train Recall</w:t>
+            </w:r>
+          </w:p>
+        </w:tc>
+        <w:tc>
+          <w:tcPr>
+            <w:tcW w:type="dxa" w:w="665"/>
+          </w:tcPr>
+          <w:p>
+            <w:r>
+              <w:t>Train Fscore</w:t>
+            </w:r>
+          </w:p>
+        </w:tc>
+        <w:tc>
+          <w:tcPr>
+            <w:tcW w:type="dxa" w:w="665"/>
           </w:tcPr>
           <w:p>
             <w:r>
@@ -1165,7 +1515,17 @@
         </w:tc>
         <w:tc>
           <w:tcPr>
-            <w:tcW w:type="dxa" w:w="1080"/>
+            <w:tcW w:type="dxa" w:w="665"/>
+          </w:tcPr>
+          <w:p>
+            <w:r>
+              <w:t>Valid IoU</w:t>
+            </w:r>
+          </w:p>
+        </w:tc>
+        <w:tc>
+          <w:tcPr>
+            <w:tcW w:type="dxa" w:w="665"/>
           </w:tcPr>
           <w:p>
             <w:r>
@@ -1175,7 +1535,7 @@
         </w:tc>
         <w:tc>
           <w:tcPr>
-            <w:tcW w:type="dxa" w:w="1080"/>
+            <w:tcW w:type="dxa" w:w="665"/>
           </w:tcPr>
           <w:p>
             <w:r>
@@ -1185,7 +1545,7 @@
         </w:tc>
         <w:tc>
           <w:tcPr>
-            <w:tcW w:type="dxa" w:w="1080"/>
+            <w:tcW w:type="dxa" w:w="665"/>
           </w:tcPr>
           <w:p>
             <w:r>
@@ -1193,11 +1553,21 @@
             </w:r>
           </w:p>
         </w:tc>
+        <w:tc>
+          <w:tcPr>
+            <w:tcW w:type="dxa" w:w="665"/>
+          </w:tcPr>
+          <w:p>
+            <w:r>
+              <w:t>Valid Fscore</w:t>
+            </w:r>
+          </w:p>
+        </w:tc>
       </w:tr>
       <w:tr>
         <w:tc>
           <w:tcPr>
-            <w:tcW w:type="dxa" w:w="1080"/>
+            <w:tcW w:type="dxa" w:w="665"/>
           </w:tcPr>
           <w:p>
             <w:r>
@@ -1207,7 +1577,7 @@
         </w:tc>
         <w:tc>
           <w:tcPr>
-            <w:tcW w:type="dxa" w:w="1080"/>
+            <w:tcW w:type="dxa" w:w="665"/>
           </w:tcPr>
           <w:p>
             <w:r>
@@ -1217,7 +1587,7 @@
         </w:tc>
         <w:tc>
           <w:tcPr>
-            <w:tcW w:type="dxa" w:w="1080"/>
+            <w:tcW w:type="dxa" w:w="665"/>
           </w:tcPr>
           <w:p>
             <w:r>
@@ -1227,7 +1597,7 @@
         </w:tc>
         <w:tc>
           <w:tcPr>
-            <w:tcW w:type="dxa" w:w="1080"/>
+            <w:tcW w:type="dxa" w:w="665"/>
           </w:tcPr>
           <w:p>
             <w:r>
@@ -1237,7 +1607,37 @@
         </w:tc>
         <w:tc>
           <w:tcPr>
-            <w:tcW w:type="dxa" w:w="1080"/>
+            <w:tcW w:type="dxa" w:w="665"/>
+          </w:tcPr>
+          <w:p>
+            <w:r>
+              <w:t>0.9179</w:t>
+            </w:r>
+          </w:p>
+        </w:tc>
+        <w:tc>
+          <w:tcPr>
+            <w:tcW w:type="dxa" w:w="665"/>
+          </w:tcPr>
+          <w:p>
+            <w:r>
+              <w:t>0.9240</w:t>
+            </w:r>
+          </w:p>
+        </w:tc>
+        <w:tc>
+          <w:tcPr>
+            <w:tcW w:type="dxa" w:w="665"/>
+          </w:tcPr>
+          <w:p>
+            <w:r>
+              <w:t>0.9209</w:t>
+            </w:r>
+          </w:p>
+        </w:tc>
+        <w:tc>
+          <w:tcPr>
+            <w:tcW w:type="dxa" w:w="665"/>
           </w:tcPr>
           <w:p>
             <w:r>
@@ -1247,7 +1647,17 @@
         </w:tc>
         <w:tc>
           <w:tcPr>
-            <w:tcW w:type="dxa" w:w="1080"/>
+            <w:tcW w:type="dxa" w:w="665"/>
+          </w:tcPr>
+          <w:p>
+            <w:r>
+              <w:t>0.7351</w:t>
+            </w:r>
+          </w:p>
+        </w:tc>
+        <w:tc>
+          <w:tcPr>
+            <w:tcW w:type="dxa" w:w="665"/>
           </w:tcPr>
           <w:p>
             <w:r>
@@ -1257,7 +1667,7 @@
         </w:tc>
         <w:tc>
           <w:tcPr>
-            <w:tcW w:type="dxa" w:w="1080"/>
+            <w:tcW w:type="dxa" w:w="665"/>
           </w:tcPr>
           <w:p>
             <w:r>
@@ -1267,7 +1677,7 @@
         </w:tc>
         <w:tc>
           <w:tcPr>
-            <w:tcW w:type="dxa" w:w="1080"/>
+            <w:tcW w:type="dxa" w:w="665"/>
           </w:tcPr>
           <w:p>
             <w:r>
@@ -1275,11 +1685,21 @@
             </w:r>
           </w:p>
         </w:tc>
+        <w:tc>
+          <w:tcPr>
+            <w:tcW w:type="dxa" w:w="665"/>
+          </w:tcPr>
+          <w:p>
+            <w:r>
+              <w:t>0.8365</w:t>
+            </w:r>
+          </w:p>
+        </w:tc>
       </w:tr>
     </w:tbl>
     <w:p>
       <w:r>
-        <w:t>Best Epoch (based on validation accuracy): 1.0000</w:t>
+        <w:t>Best Epoch: 1</w:t>
       </w:r>
     </w:p>
     <w:p>

</xml_diff>